<commit_message>
Atualização de aulas MD 15/08
</commit_message>
<xml_diff>
--- a/UNIUBE-MD/Atividades de Fixação.docx
+++ b/UNIUBE-MD/Atividades de Fixação.docx
@@ -372,99 +372,7 @@
         <w:rPr>
           <w:rFonts w:cstheme="minorHAnsi"/>
         </w:rPr>
-        <w:t>↔</w:t>
-      </w:r>
-      <w:r>
-        <w:rPr>
-          <w:rFonts w:cstheme="minorHAnsi"/>
-        </w:rPr>
-        <w:t xml:space="preserve"> </w:t>
-      </w:r>
-      <m:oMath>
-        <m:acc>
-          <m:accPr>
-            <m:chr m:val="̅"/>
-            <m:ctrlPr>
-              <w:rPr>
-                <w:rFonts w:ascii="Cambria Math" w:hAnsi="Cambria Math"/>
-                <w:i/>
-                <w:lang w:val="en-US"/>
-              </w:rPr>
-            </m:ctrlPr>
-          </m:accPr>
-          <m:e>
-            <m:r>
-              <w:rPr>
-                <w:rFonts w:ascii="Cambria Math" w:hAnsi="Cambria Math"/>
-              </w:rPr>
-              <m:t>(</m:t>
-            </m:r>
-            <m:r>
-              <w:rPr>
-                <w:rFonts w:ascii="Cambria Math" w:hAnsi="Cambria Math"/>
-                <w:lang w:val="en-US"/>
-              </w:rPr>
-              <m:t>P</m:t>
-            </m:r>
-            <m:r>
-              <m:rPr>
-                <m:sty m:val="b"/>
-              </m:rPr>
-              <w:rPr>
-                <w:rFonts w:ascii="Cambria Math" w:hAnsi="Cambria Math" w:cs="Cambria Math"/>
-              </w:rPr>
-              <m:t>∨</m:t>
-            </m:r>
-            <m:r>
-              <m:rPr>
-                <m:sty m:val="p"/>
-              </m:rPr>
-              <w:rPr>
-                <w:rFonts w:ascii="Cambria Math" w:hAnsi="Cambria Math"/>
-              </w:rPr>
-              <m:t xml:space="preserve"> Q</m:t>
-            </m:r>
-            <m:r>
-              <w:rPr>
-                <w:rFonts w:ascii="Cambria Math" w:hAnsi="Cambria Math"/>
-              </w:rPr>
-              <m:t xml:space="preserve"> </m:t>
-            </m:r>
-            <m:r>
-              <w:rPr>
-                <w:rFonts w:ascii="Cambria Math" w:hAnsi="Cambria Math"/>
-              </w:rPr>
-              <m:t>)</m:t>
-            </m:r>
-          </m:e>
-        </m:acc>
-      </m:oMath>
-      <w:r>
-        <w:rPr>
-          <w:rFonts w:eastAsiaTheme="minorEastAsia" w:cstheme="minorHAnsi"/>
-        </w:rPr>
-        <w:t xml:space="preserve"> </w:t>
-      </w:r>
-      <w:r>
-        <w:rPr>
-          <w:rFonts w:eastAsiaTheme="minorEastAsia" w:cstheme="minorHAnsi"/>
-        </w:rPr>
-        <w:t>é uma tautologia.</w:t>
-      </w:r>
-    </w:p>
-    <w:p>
-      <w:pPr>
-        <w:pStyle w:val="PargrafodaLista"/>
-        <w:numPr>
-          <w:ilvl w:val="0"/>
-          <w:numId w:val="9"/>
-        </w:numPr>
-      </w:pPr>
-      <w:r>
-        <w:t>As proposições</w:t>
-      </w:r>
-      <w:r>
-        <w:t xml:space="preserve"> </w:t>
+        <w:t xml:space="preserve">↔ </w:t>
       </w:r>
       <m:oMath>
         <m:acc>
@@ -521,6 +429,94 @@
       </m:oMath>
       <w:r>
         <w:rPr>
+          <w:rFonts w:eastAsiaTheme="minorEastAsia" w:cstheme="minorHAnsi"/>
+        </w:rPr>
+        <w:t xml:space="preserve"> </w:t>
+      </w:r>
+      <w:proofErr w:type="spellStart"/>
+      <w:r>
+        <w:rPr>
+          <w:rFonts w:eastAsiaTheme="minorEastAsia" w:cstheme="minorHAnsi"/>
+        </w:rPr>
+        <w:t>é</w:t>
+      </w:r>
+      <w:proofErr w:type="spellEnd"/>
+      <w:r>
+        <w:rPr>
+          <w:rFonts w:eastAsiaTheme="minorEastAsia" w:cstheme="minorHAnsi"/>
+        </w:rPr>
+        <w:t xml:space="preserve"> uma tautologia.</w:t>
+      </w:r>
+    </w:p>
+    <w:p>
+      <w:pPr>
+        <w:pStyle w:val="PargrafodaLista"/>
+        <w:numPr>
+          <w:ilvl w:val="0"/>
+          <w:numId w:val="9"/>
+        </w:numPr>
+      </w:pPr>
+      <w:r>
+        <w:t>As proposições</w:t>
+      </w:r>
+      <w:r>
+        <w:t xml:space="preserve"> </w:t>
+      </w:r>
+      <m:oMath>
+        <m:acc>
+          <m:accPr>
+            <m:chr m:val="̅"/>
+            <m:ctrlPr>
+              <w:rPr>
+                <w:rFonts w:ascii="Cambria Math" w:hAnsi="Cambria Math"/>
+                <w:i/>
+                <w:lang w:val="en-US"/>
+              </w:rPr>
+            </m:ctrlPr>
+          </m:accPr>
+          <m:e>
+            <m:r>
+              <w:rPr>
+                <w:rFonts w:ascii="Cambria Math" w:hAnsi="Cambria Math"/>
+              </w:rPr>
+              <m:t>(</m:t>
+            </m:r>
+            <m:r>
+              <w:rPr>
+                <w:rFonts w:ascii="Cambria Math" w:hAnsi="Cambria Math"/>
+                <w:lang w:val="en-US"/>
+              </w:rPr>
+              <m:t>P</m:t>
+            </m:r>
+            <m:r>
+              <m:rPr>
+                <m:sty m:val="b"/>
+              </m:rPr>
+              <w:rPr>
+                <w:rFonts w:ascii="Cambria Math" w:hAnsi="Cambria Math" w:cs="Cambria Math"/>
+              </w:rPr>
+              <m:t>∨</m:t>
+            </m:r>
+            <m:r>
+              <m:rPr>
+                <m:sty m:val="p"/>
+              </m:rPr>
+              <w:rPr>
+                <w:rFonts w:ascii="Cambria Math" w:hAnsi="Cambria Math"/>
+              </w:rPr>
+              <m:t xml:space="preserve"> Q</m:t>
+            </m:r>
+            <m:r>
+              <w:rPr>
+                <w:rFonts w:ascii="Cambria Math" w:hAnsi="Cambria Math"/>
+              </w:rPr>
+              <m:t xml:space="preserve"> )</m:t>
+            </m:r>
+          </m:e>
+        </m:acc>
+      </m:oMath>
+      <w:r>
+        <w:rPr>
           <w:rFonts w:eastAsiaTheme="minorEastAsia"/>
         </w:rPr>
         <w:t xml:space="preserve"> e</w:t>
@@ -557,13 +553,7 @@
           <w:rPr>
             <w:rFonts w:ascii="Cambria Math" w:hAnsi="Cambria Math" w:cs="Cambria Math"/>
           </w:rPr>
-          <m:t>∧</m:t>
-        </m:r>
-        <m:r>
-          <w:rPr>
-            <w:rFonts w:ascii="Cambria Math" w:hAnsi="Cambria Math" w:cs="Cambria Math"/>
-          </w:rPr>
-          <m:t xml:space="preserve"> </m:t>
+          <m:t xml:space="preserve">∧ </m:t>
         </m:r>
         <m:acc>
           <m:accPr>
@@ -711,7 +701,7 @@
         <w:t>S</w:t>
       </w:r>
       <w:r>
-        <w:t>e Enzo come espinafre, então Maria Valentina come maçã.</w:t>
+        <w:t>e Enzo come espinafre, então Maria come maçã.</w:t>
       </w:r>
     </w:p>
     <w:p>
@@ -1077,40 +1067,33 @@
           </w:rPr>
           <m:t xml:space="preserve"> </m:t>
         </m:r>
+        <m:bar>
+          <m:barPr>
+            <m:pos m:val="top"/>
+            <m:ctrlPr>
+              <w:rPr>
+                <w:rFonts w:ascii="Cambria Math" w:hAnsi="Cambria Math"/>
+                <w:i/>
+                <w:lang w:val="en-US"/>
+              </w:rPr>
+            </m:ctrlPr>
+          </m:barPr>
+          <m:e>
+            <m:r>
+              <w:rPr>
+                <w:rFonts w:ascii="Cambria Math" w:hAnsi="Cambria Math"/>
+                <w:lang w:val="en-US"/>
+              </w:rPr>
+              <m:t>C</m:t>
+            </m:r>
+          </m:e>
+        </m:bar>
         <m:r>
           <w:rPr>
             <w:rFonts w:ascii="Cambria Math" w:hAnsi="Cambria Math"/>
             <w:lang w:val="en-US"/>
           </w:rPr>
-          <m:t>C</m:t>
-        </m:r>
-        <m:r>
-          <w:rPr>
-            <w:rFonts w:ascii="Cambria Math" w:hAnsi="Cambria Math"/>
-            <w:lang w:val="en-US"/>
-          </w:rPr>
-          <m:t xml:space="preserve">+ </m:t>
-        </m:r>
-        <m:r>
-          <w:rPr>
-            <w:rFonts w:ascii="Cambria Math" w:hAnsi="Cambria Math"/>
-            <w:lang w:val="en-US"/>
-          </w:rPr>
-          <m:t>A</m:t>
-        </m:r>
-        <m:r>
-          <w:rPr>
-            <w:rFonts w:ascii="Cambria Math" w:hAnsi="Cambria Math"/>
-            <w:lang w:val="en-US"/>
-          </w:rPr>
-          <m:t xml:space="preserve"> </m:t>
-        </m:r>
-        <m:r>
-          <w:rPr>
-            <w:rFonts w:ascii="Cambria Math" w:hAnsi="Cambria Math"/>
-            <w:lang w:val="en-US"/>
-          </w:rPr>
-          <m:t>B</m:t>
+          <m:t>+ A B</m:t>
         </m:r>
       </m:oMath>
     </w:p>
@@ -4015,7 +3998,13 @@
         <w:spacing w:after="0"/>
       </w:pPr>
       <w:r>
-        <w:t>Monte a tabela verdade da expressão, em sequência, simplifique-a:</w:t>
+        <w:t>Monte a tabela verdade da expressão, em sequência, simplifique-a</w:t>
+      </w:r>
+      <w:r>
+        <w:t xml:space="preserve"> e prove a equivalência pela tabela verdade</w:t>
+      </w:r>
+      <w:r>
+        <w:t>:</w:t>
       </w:r>
     </w:p>
     <w:p>
@@ -4036,14 +4025,7 @@
               <w:rFonts w:ascii="Cambria Math" w:hAnsi="Cambria Math"/>
               <w:lang w:val="en-US"/>
             </w:rPr>
-            <m:t>A</m:t>
-          </m:r>
-          <m:r>
-            <w:rPr>
-              <w:rFonts w:ascii="Cambria Math" w:hAnsi="Cambria Math"/>
-              <w:lang w:val="en-US"/>
-            </w:rPr>
-            <m:t xml:space="preserve"> </m:t>
+            <m:t xml:space="preserve">A </m:t>
           </m:r>
           <m:bar>
             <m:barPr>
@@ -4127,21 +4109,7 @@
               <w:rFonts w:ascii="Cambria Math" w:hAnsi="Cambria Math"/>
               <w:lang w:val="en-US"/>
             </w:rPr>
-            <m:t xml:space="preserve"> </m:t>
-          </m:r>
-          <m:r>
-            <w:rPr>
-              <w:rFonts w:ascii="Cambria Math" w:hAnsi="Cambria Math"/>
-              <w:lang w:val="en-US"/>
-            </w:rPr>
-            <m:t>B</m:t>
-          </m:r>
-          <m:r>
-            <w:rPr>
-              <w:rFonts w:ascii="Cambria Math" w:hAnsi="Cambria Math"/>
-              <w:lang w:val="en-US"/>
-            </w:rPr>
-            <m:t xml:space="preserve"> C+ </m:t>
+            <m:t xml:space="preserve"> B C+ </m:t>
           </m:r>
           <m:bar>
             <m:barPr>
@@ -4169,21 +4137,7 @@
               <w:rFonts w:ascii="Cambria Math" w:hAnsi="Cambria Math"/>
               <w:lang w:val="en-US"/>
             </w:rPr>
-            <m:t xml:space="preserve"> </m:t>
-          </m:r>
-          <m:r>
-            <w:rPr>
-              <w:rFonts w:ascii="Cambria Math" w:hAnsi="Cambria Math"/>
-              <w:lang w:val="en-US"/>
-            </w:rPr>
-            <m:t>B</m:t>
-          </m:r>
-          <m:r>
-            <w:rPr>
-              <w:rFonts w:ascii="Cambria Math" w:hAnsi="Cambria Math"/>
-              <w:lang w:val="en-US"/>
-            </w:rPr>
-            <m:t xml:space="preserve"> </m:t>
+            <m:t xml:space="preserve"> B </m:t>
           </m:r>
           <m:bar>
             <m:barPr>
@@ -4287,7 +4241,10 @@
         <w:spacing w:after="0"/>
       </w:pPr>
       <w:r>
-        <w:t>Converta a seguinte expressão da FND para a FNC e monte a tabela verdade de ambas, provando sua equivalência</w:t>
+        <w:t>Simplifique e c</w:t>
+      </w:r>
+      <w:r>
+        <w:t>onverta a seguinte expressão da FND para a FNC e monte a tabela verdade de ambas, provando sua equivalência</w:t>
       </w:r>
     </w:p>
     <w:p>
@@ -4308,49 +4265,7 @@
               <w:rFonts w:ascii="Cambria Math" w:hAnsi="Cambria Math"/>
               <w:lang w:val="en-US"/>
             </w:rPr>
-            <m:t>A</m:t>
-          </m:r>
-          <m:r>
-            <w:rPr>
-              <w:rFonts w:ascii="Cambria Math" w:hAnsi="Cambria Math"/>
-              <w:lang w:val="en-US"/>
-            </w:rPr>
-            <m:t xml:space="preserve"> </m:t>
-          </m:r>
-          <m:r>
-            <w:rPr>
-              <w:rFonts w:ascii="Cambria Math" w:hAnsi="Cambria Math"/>
-              <w:lang w:val="en-US"/>
-            </w:rPr>
-            <m:t>B</m:t>
-          </m:r>
-          <m:r>
-            <w:rPr>
-              <w:rFonts w:ascii="Cambria Math" w:hAnsi="Cambria Math"/>
-              <w:lang w:val="en-US"/>
-            </w:rPr>
-            <m:t xml:space="preserve"> </m:t>
-          </m:r>
-          <m:r>
-            <w:rPr>
-              <w:rFonts w:ascii="Cambria Math" w:hAnsi="Cambria Math"/>
-              <w:lang w:val="en-US"/>
-            </w:rPr>
-            <m:t>C</m:t>
-          </m:r>
-          <m:r>
-            <w:rPr>
-              <w:rFonts w:ascii="Cambria Math" w:hAnsi="Cambria Math"/>
-              <w:lang w:val="en-US"/>
-            </w:rPr>
-            <m:t xml:space="preserve">+ </m:t>
-          </m:r>
-          <m:r>
-            <w:rPr>
-              <w:rFonts w:ascii="Cambria Math" w:hAnsi="Cambria Math"/>
-              <w:lang w:val="en-US"/>
-            </w:rPr>
-            <m:t xml:space="preserve">A </m:t>
+            <m:t xml:space="preserve">A B C+ A </m:t>
           </m:r>
           <m:bar>
             <m:barPr>
@@ -4406,21 +4321,7 @@
               <w:rFonts w:ascii="Cambria Math" w:hAnsi="Cambria Math"/>
               <w:lang w:val="en-US"/>
             </w:rPr>
-            <m:t xml:space="preserve">+ </m:t>
-          </m:r>
-          <m:r>
-            <w:rPr>
-              <w:rFonts w:ascii="Cambria Math" w:hAnsi="Cambria Math"/>
-              <w:lang w:val="en-US"/>
-            </w:rPr>
-            <m:t>A</m:t>
-          </m:r>
-          <m:r>
-            <w:rPr>
-              <w:rFonts w:ascii="Cambria Math" w:hAnsi="Cambria Math"/>
-              <w:lang w:val="en-US"/>
-            </w:rPr>
-            <m:t xml:space="preserve"> </m:t>
+            <m:t xml:space="preserve">+ A </m:t>
           </m:r>
           <m:bar>
             <m:barPr>
@@ -4448,35 +4349,7 @@
               <w:rFonts w:ascii="Cambria Math" w:hAnsi="Cambria Math"/>
               <w:lang w:val="en-US"/>
             </w:rPr>
-            <m:t xml:space="preserve"> </m:t>
-          </m:r>
-          <m:r>
-            <w:rPr>
-              <w:rFonts w:ascii="Cambria Math" w:hAnsi="Cambria Math"/>
-              <w:lang w:val="en-US"/>
-            </w:rPr>
-            <m:t>C</m:t>
-          </m:r>
-          <m:r>
-            <w:rPr>
-              <w:rFonts w:ascii="Cambria Math" w:hAnsi="Cambria Math"/>
-              <w:lang w:val="en-US"/>
-            </w:rPr>
-            <m:t xml:space="preserve">+ A </m:t>
-          </m:r>
-          <m:r>
-            <w:rPr>
-              <w:rFonts w:ascii="Cambria Math" w:hAnsi="Cambria Math"/>
-              <w:lang w:val="en-US"/>
-            </w:rPr>
-            <m:t>B</m:t>
-          </m:r>
-          <m:r>
-            <w:rPr>
-              <w:rFonts w:ascii="Cambria Math" w:hAnsi="Cambria Math"/>
-              <w:lang w:val="en-US"/>
-            </w:rPr>
-            <m:t xml:space="preserve"> </m:t>
+            <m:t xml:space="preserve"> C+ A B </m:t>
           </m:r>
           <m:bar>
             <m:barPr>
@@ -4602,42 +4475,7 @@
               <w:rFonts w:ascii="Cambria Math" w:hAnsi="Cambria Math"/>
               <w:lang w:val="en-US"/>
             </w:rPr>
-            <m:t>A</m:t>
-          </m:r>
-          <m:r>
-            <w:rPr>
-              <w:rFonts w:ascii="Cambria Math" w:hAnsi="Cambria Math"/>
-              <w:lang w:val="en-US"/>
-            </w:rPr>
-            <m:t xml:space="preserve"> </m:t>
-          </m:r>
-          <m:r>
-            <w:rPr>
-              <w:rFonts w:ascii="Cambria Math" w:hAnsi="Cambria Math"/>
-              <w:lang w:val="en-US"/>
-            </w:rPr>
-            <m:t>B</m:t>
-          </m:r>
-          <m:r>
-            <w:rPr>
-              <w:rFonts w:ascii="Cambria Math" w:hAnsi="Cambria Math"/>
-              <w:lang w:val="en-US"/>
-            </w:rPr>
-            <m:t xml:space="preserve"> </m:t>
-          </m:r>
-          <m:r>
-            <w:rPr>
-              <w:rFonts w:ascii="Cambria Math" w:hAnsi="Cambria Math"/>
-              <w:lang w:val="en-US"/>
-            </w:rPr>
-            <m:t>C</m:t>
-          </m:r>
-          <m:r>
-            <w:rPr>
-              <w:rFonts w:ascii="Cambria Math" w:hAnsi="Cambria Math"/>
-              <w:lang w:val="en-US"/>
-            </w:rPr>
-            <m:t xml:space="preserve"> </m:t>
+            <m:t xml:space="preserve">A B C </m:t>
           </m:r>
           <m:bar>
             <m:barPr>
@@ -4721,35 +4559,7 @@
               <w:rFonts w:ascii="Cambria Math" w:hAnsi="Cambria Math"/>
               <w:lang w:val="en-US"/>
             </w:rPr>
-            <m:t xml:space="preserve"> </m:t>
-          </m:r>
-          <m:r>
-            <w:rPr>
-              <w:rFonts w:ascii="Cambria Math" w:hAnsi="Cambria Math"/>
-              <w:lang w:val="en-US"/>
-            </w:rPr>
-            <m:t>C D</m:t>
-          </m:r>
-          <m:r>
-            <w:rPr>
-              <w:rFonts w:ascii="Cambria Math" w:hAnsi="Cambria Math"/>
-              <w:lang w:val="en-US"/>
-            </w:rPr>
-            <m:t xml:space="preserve">+ </m:t>
-          </m:r>
-          <m:r>
-            <w:rPr>
-              <w:rFonts w:ascii="Cambria Math" w:hAnsi="Cambria Math"/>
-              <w:lang w:val="en-US"/>
-            </w:rPr>
-            <m:t>A</m:t>
-          </m:r>
-          <m:r>
-            <w:rPr>
-              <w:rFonts w:ascii="Cambria Math" w:hAnsi="Cambria Math"/>
-              <w:lang w:val="en-US"/>
-            </w:rPr>
-            <m:t xml:space="preserve"> </m:t>
+            <m:t xml:space="preserve"> C D+ A </m:t>
           </m:r>
           <m:bar>
             <m:barPr>
@@ -4805,14 +4615,7 @@
               <w:rFonts w:ascii="Cambria Math" w:hAnsi="Cambria Math"/>
               <w:lang w:val="en-US"/>
             </w:rPr>
-            <m:t xml:space="preserve"> D</m:t>
-          </m:r>
-          <m:r>
-            <w:rPr>
-              <w:rFonts w:ascii="Cambria Math" w:hAnsi="Cambria Math"/>
-              <w:lang w:val="en-US"/>
-            </w:rPr>
-            <m:t xml:space="preserve">+ </m:t>
+            <m:t xml:space="preserve"> D+ </m:t>
           </m:r>
           <m:bar>
             <m:barPr>
@@ -6576,6 +6379,7 @@
   <w:style w:type="character" w:default="1" w:styleId="Fontepargpadro">
     <w:name w:val="Default Paragraph Font"/>
     <w:uiPriority w:val="1"/>
+    <w:semiHidden/>
     <w:unhideWhenUsed/>
   </w:style>
   <w:style w:type="table" w:default="1" w:styleId="Tabelanormal">

</xml_diff>

<commit_message>
Atualização do roteiro de PDI
</commit_message>
<xml_diff>
--- a/UNIUBE-MD/Atividades de Fixação.docx
+++ b/UNIUBE-MD/Atividades de Fixação.docx
@@ -41,71 +41,6 @@
     <w:p>
       <w:pPr>
         <w:spacing w:after="0"/>
-        <w:jc w:val="center"/>
-        <w:rPr>
-          <w:b/>
-          <w:bCs/>
-          <w:i/>
-          <w:iCs/>
-          <w:sz w:val="36"/>
-          <w:szCs w:val="36"/>
-        </w:rPr>
-      </w:pPr>
-    </w:p>
-    <w:p>
-      <w:pPr>
-        <w:spacing w:after="0"/>
-        <w:jc w:val="center"/>
-      </w:pPr>
-      <w:r>
-        <w:t xml:space="preserve">Matéria de </w:t>
-      </w:r>
-      <w:r>
-        <w:t>Matemática Discreta</w:t>
-      </w:r>
-    </w:p>
-    <w:p>
-      <w:pPr>
-        <w:pStyle w:val="PargrafodaLista"/>
-        <w:spacing w:after="0"/>
-      </w:pPr>
-    </w:p>
-    <w:p>
-      <w:pPr>
-        <w:pStyle w:val="PargrafodaLista"/>
-        <w:numPr>
-          <w:ilvl w:val="0"/>
-          <w:numId w:val="4"/>
-        </w:numPr>
-        <w:spacing w:after="0"/>
-      </w:pPr>
-      <w:r>
-        <w:t xml:space="preserve">As questões discursivas podem ser resolvidas </w:t>
-      </w:r>
-      <w:r>
-        <w:t xml:space="preserve">neste documento, </w:t>
-      </w:r>
-      <w:r>
-        <w:t>em arquivos separados ou como fotografias (em caso de manuscrito).</w:t>
-      </w:r>
-    </w:p>
-    <w:p>
-      <w:pPr>
-        <w:pStyle w:val="PargrafodaLista"/>
-        <w:numPr>
-          <w:ilvl w:val="0"/>
-          <w:numId w:val="4"/>
-        </w:numPr>
-        <w:spacing w:after="0"/>
-      </w:pPr>
-      <w:r>
-        <w:t xml:space="preserve">Em caso manuscrito, manter as respostas legíveis e organizadas. </w:t>
-      </w:r>
-    </w:p>
-    <w:p>
-      <w:pPr>
-        <w:spacing w:after="0"/>
-        <w:ind w:left="708"/>
       </w:pPr>
     </w:p>
     <w:p>
@@ -1168,6 +1103,62 @@
           <m:t>A B+A (B+C)</m:t>
         </m:r>
       </m:oMath>
+    </w:p>
+    <w:p>
+      <w:pPr>
+        <w:spacing w:after="0"/>
+        <w:rPr>
+          <w:lang w:val="en-US"/>
+        </w:rPr>
+      </w:pPr>
+    </w:p>
+    <w:p>
+      <w:pPr>
+        <w:spacing w:after="0"/>
+        <w:rPr>
+          <w:lang w:val="en-US"/>
+        </w:rPr>
+      </w:pPr>
+    </w:p>
+    <w:p>
+      <w:pPr>
+        <w:spacing w:after="0"/>
+        <w:rPr>
+          <w:lang w:val="en-US"/>
+        </w:rPr>
+      </w:pPr>
+    </w:p>
+    <w:p>
+      <w:pPr>
+        <w:spacing w:after="0"/>
+        <w:rPr>
+          <w:lang w:val="en-US"/>
+        </w:rPr>
+      </w:pPr>
+    </w:p>
+    <w:p>
+      <w:pPr>
+        <w:spacing w:after="0"/>
+        <w:rPr>
+          <w:lang w:val="en-US"/>
+        </w:rPr>
+      </w:pPr>
+    </w:p>
+    <w:p>
+      <w:pPr>
+        <w:spacing w:after="0"/>
+        <w:rPr>
+          <w:lang w:val="en-US"/>
+        </w:rPr>
+      </w:pPr>
+    </w:p>
+    <w:p>
+      <w:pPr>
+        <w:spacing w:after="0"/>
+        <w:rPr>
+          <w:lang w:val="en-US"/>
+        </w:rPr>
+      </w:pPr>
     </w:p>
     <w:p>
       <w:pPr>

</xml_diff>